<commit_message>
Standardize EEG data and preprocessing specifications
</commit_message>
<xml_diff>
--- a/资料/数据集说明/数据集说明.docx
+++ b/资料/数据集说明/数据集说明.docx
@@ -962,16 +962,8 @@
             <w:vAlign w:val="center"/>
           </w:tcPr>
           <w:p>
-            <w:pPr>
-              <w:spacing w:before="0" w:after="0" w:line="240" w:lineRule="auto"/>
-            </w:pPr>
             <w:r>
-              <w:rPr>
-                <w:rFonts w:ascii="微软雅黑" w:hAnsi="微软雅黑" w:eastAsia="微软雅黑"/>
-                <w:b w:val="0"/>
-                <w:sz w:val="16"/>
-              </w:rPr>
-              <w:t>左、右、双脚、舌</w:t>
+              <w:t>本项目仅使用左手、右手；静息由合格休息段构造；双脚、舌头弃用</w:t>
             </w:r>
           </w:p>
         </w:tc>
@@ -1674,6 +1666,41 @@
       <w:bookmarkStart w:id="0" w:name="_GoBack"/>
       <w:bookmarkEnd w:id="0"/>
     </w:p>
+    <w:p>
+      <w:r>
+        <w:t>三、本项目对 BCI Competition IV 2a 的统一使用规则</w:t>
+      </w:r>
+    </w:p>
+    <w:p>
+      <w:r>
+        <w:t>1. 任务类别仅保留左手和右手，统一编码为0和1；双脚和舌头试次直接丢弃。</w:t>
+      </w:r>
+    </w:p>
+    <w:p>
+      <w:r>
+        <w:t>2. 左手/右手截取单试次绝对时间 t=2~6 s，即 Cue 出现后0~4 s。</w:t>
+      </w:r>
+    </w:p>
+    <w:p>
+      <w:r>
+        <w:t>3. 静息类编码为2，从相邻任务之间无Cue、无运动想象、无伪迹的连续休息/准备段截取固定4 s；长度不足、与任务窗重叠或含伪迹的候选段丢弃。</w:t>
+      </w:r>
+    </w:p>
+    <w:p>
+      <w:r>
+        <w:t>4. 全部样本统一为250 Hz、8通道、1000时间点，模型输入张量为(B, 1, 8, 1000)。</w:t>
+      </w:r>
+    </w:p>
+    <w:p>
+      <w:r>
+        <w:t>固定通道顺序：Cz、C3、C4、CP3、FC4、FC3、CP4、CPz。该顺序同时作为模型输入通道轴顺序，所有数据集、训练、微调与在线推理均不得按字母或原始文件顺序重新排列。</w:t>
+      </w:r>
+    </w:p>
+    <w:p>
+      <w:r>
+        <w:t>通道索引映射：0=Cz，1=C3，2=C4，3=CP3，4=FC4，5=FC3，6=CP4，7=CPz。</w:t>
+      </w:r>
+    </w:p>
     <w:sectPr>
       <w:pgSz w:w="15840" w:h="12240" w:orient="landscape"/>
       <w:pgMar w:top="709" w:right="652" w:bottom="709" w:left="652" w:header="720" w:footer="720" w:gutter="0"/>

</xml_diff>